<commit_message>
Refactor code structure for improved readability and maintainability
</commit_message>
<xml_diff>
--- a/backend/app/tests/reports/modules/test_auto_connector_documentation.docx
+++ b/backend/app/tests/reports/modules/test_auto_connector_documentation.docx
@@ -12,17 +12,17 @@
     </w:p>
     <w:p>
       <w:r>
-        <w:t>Generated at: 2026-08-04T09:15:31+00:00</w:t>
+        <w:t>Generated at: 2026-09-23T06:18:31+00:00</w:t>
       </w:r>
     </w:p>
     <w:p>
       <w:r>
-        <w:t>Test session started: 2026-08-04T09:15:22+00:00</w:t>
+        <w:t>Test session started: 2026-09-23T06:18:30+00:00</w:t>
       </w:r>
     </w:p>
     <w:p>
       <w:r>
-        <w:t>Pytest exit status: 2</w:t>
+        <w:t>Pytest exit status: 0</w:t>
       </w:r>
     </w:p>
     <w:p>
@@ -110,6 +110,28 @@
           </w:tcPr>
           <w:p>
             <w:r>
+              <w:t>22</w:t>
+            </w:r>
+          </w:p>
+        </w:tc>
+      </w:tr>
+      <w:tr>
+        <w:tc>
+          <w:tcPr>
+            <w:tcW w:w="2400" w:type="dxa"/>
+          </w:tcPr>
+          <w:p>
+            <w:r>
+              <w:t>Failed</w:t>
+            </w:r>
+          </w:p>
+        </w:tc>
+        <w:tc>
+          <w:tcPr>
+            <w:tcW w:w="2400" w:type="dxa"/>
+          </w:tcPr>
+          <w:p>
+            <w:r>
               <w:t>0</w:t>
             </w:r>
           </w:p>
@@ -122,7 +144,7 @@
           </w:tcPr>
           <w:p>
             <w:r>
-              <w:t>Failed</w:t>
+              <w:t>Skipped</w:t>
             </w:r>
           </w:p>
         </w:tc>
@@ -144,7 +166,7 @@
           </w:tcPr>
           <w:p>
             <w:r>
-              <w:t>Skipped</w:t>
+              <w:t>Not run</w:t>
             </w:r>
           </w:p>
         </w:tc>
@@ -155,28 +177,6 @@
           <w:p>
             <w:r>
               <w:t>0</w:t>
-            </w:r>
-          </w:p>
-        </w:tc>
-      </w:tr>
-      <w:tr>
-        <w:tc>
-          <w:tcPr>
-            <w:tcW w:w="2400" w:type="dxa"/>
-          </w:tcPr>
-          <w:p>
-            <w:r>
-              <w:t>Not run</w:t>
-            </w:r>
-          </w:p>
-        </w:tc>
-        <w:tc>
-          <w:tcPr>
-            <w:tcW w:w="2400" w:type="dxa"/>
-          </w:tcPr>
-          <w:p>
-            <w:r>
-              <w:t>22</w:t>
             </w:r>
           </w:p>
         </w:tc>
@@ -338,17 +338,17 @@
           </w:tcPr>
           <w:p>
             <w:r>
-              <w:t>Not run</w:t>
-            </w:r>
-          </w:p>
-        </w:tc>
-        <w:tc>
-          <w:tcPr>
-            <w:tcW w:w="2400" w:type="dxa"/>
-          </w:tcPr>
-          <w:p>
-            <w:r>
-              <w:t>0.000</w:t>
+              <w:t>Passed</w:t>
+            </w:r>
+          </w:p>
+        </w:tc>
+        <w:tc>
+          <w:tcPr>
+            <w:tcW w:w="2400" w:type="dxa"/>
+          </w:tcPr>
+          <w:p>
+            <w:r>
+              <w:t>0.014</w:t>
             </w:r>
           </w:p>
         </w:tc>
@@ -410,17 +410,17 @@
           </w:tcPr>
           <w:p>
             <w:r>
-              <w:t>Not run</w:t>
-            </w:r>
-          </w:p>
-        </w:tc>
-        <w:tc>
-          <w:tcPr>
-            <w:tcW w:w="2400" w:type="dxa"/>
-          </w:tcPr>
-          <w:p>
-            <w:r>
-              <w:t>0.000</w:t>
+              <w:t>Passed</w:t>
+            </w:r>
+          </w:p>
+        </w:tc>
+        <w:tc>
+          <w:tcPr>
+            <w:tcW w:w="2400" w:type="dxa"/>
+          </w:tcPr>
+          <w:p>
+            <w:r>
+              <w:t>0.015</w:t>
             </w:r>
           </w:p>
         </w:tc>
@@ -482,17 +482,17 @@
           </w:tcPr>
           <w:p>
             <w:r>
-              <w:t>Not run</w:t>
-            </w:r>
-          </w:p>
-        </w:tc>
-        <w:tc>
-          <w:tcPr>
-            <w:tcW w:w="2400" w:type="dxa"/>
-          </w:tcPr>
-          <w:p>
-            <w:r>
-              <w:t>0.000</w:t>
+              <w:t>Passed</w:t>
+            </w:r>
+          </w:p>
+        </w:tc>
+        <w:tc>
+          <w:tcPr>
+            <w:tcW w:w="2400" w:type="dxa"/>
+          </w:tcPr>
+          <w:p>
+            <w:r>
+              <w:t>0.013</w:t>
             </w:r>
           </w:p>
         </w:tc>
@@ -554,17 +554,17 @@
           </w:tcPr>
           <w:p>
             <w:r>
-              <w:t>Not run</w:t>
-            </w:r>
-          </w:p>
-        </w:tc>
-        <w:tc>
-          <w:tcPr>
-            <w:tcW w:w="2400" w:type="dxa"/>
-          </w:tcPr>
-          <w:p>
-            <w:r>
-              <w:t>0.000</w:t>
+              <w:t>Passed</w:t>
+            </w:r>
+          </w:p>
+        </w:tc>
+        <w:tc>
+          <w:tcPr>
+            <w:tcW w:w="2400" w:type="dxa"/>
+          </w:tcPr>
+          <w:p>
+            <w:r>
+              <w:t>0.012</w:t>
             </w:r>
           </w:p>
         </w:tc>
@@ -626,17 +626,17 @@
           </w:tcPr>
           <w:p>
             <w:r>
-              <w:t>Not run</w:t>
-            </w:r>
-          </w:p>
-        </w:tc>
-        <w:tc>
-          <w:tcPr>
-            <w:tcW w:w="2400" w:type="dxa"/>
-          </w:tcPr>
-          <w:p>
-            <w:r>
-              <w:t>0.000</w:t>
+              <w:t>Passed</w:t>
+            </w:r>
+          </w:p>
+        </w:tc>
+        <w:tc>
+          <w:tcPr>
+            <w:tcW w:w="2400" w:type="dxa"/>
+          </w:tcPr>
+          <w:p>
+            <w:r>
+              <w:t>0.023</w:t>
             </w:r>
           </w:p>
         </w:tc>
@@ -698,17 +698,17 @@
           </w:tcPr>
           <w:p>
             <w:r>
-              <w:t>Not run</w:t>
-            </w:r>
-          </w:p>
-        </w:tc>
-        <w:tc>
-          <w:tcPr>
-            <w:tcW w:w="2400" w:type="dxa"/>
-          </w:tcPr>
-          <w:p>
-            <w:r>
-              <w:t>0.000</w:t>
+              <w:t>Passed</w:t>
+            </w:r>
+          </w:p>
+        </w:tc>
+        <w:tc>
+          <w:tcPr>
+            <w:tcW w:w="2400" w:type="dxa"/>
+          </w:tcPr>
+          <w:p>
+            <w:r>
+              <w:t>0.014</w:t>
             </w:r>
           </w:p>
         </w:tc>
@@ -770,17 +770,17 @@
           </w:tcPr>
           <w:p>
             <w:r>
-              <w:t>Not run</w:t>
-            </w:r>
-          </w:p>
-        </w:tc>
-        <w:tc>
-          <w:tcPr>
-            <w:tcW w:w="2400" w:type="dxa"/>
-          </w:tcPr>
-          <w:p>
-            <w:r>
-              <w:t>0.000</w:t>
+              <w:t>Passed</w:t>
+            </w:r>
+          </w:p>
+        </w:tc>
+        <w:tc>
+          <w:tcPr>
+            <w:tcW w:w="2400" w:type="dxa"/>
+          </w:tcPr>
+          <w:p>
+            <w:r>
+              <w:t>0.047</w:t>
             </w:r>
           </w:p>
         </w:tc>
@@ -842,17 +842,17 @@
           </w:tcPr>
           <w:p>
             <w:r>
-              <w:t>Not run</w:t>
-            </w:r>
-          </w:p>
-        </w:tc>
-        <w:tc>
-          <w:tcPr>
-            <w:tcW w:w="2400" w:type="dxa"/>
-          </w:tcPr>
-          <w:p>
-            <w:r>
-              <w:t>0.000</w:t>
+              <w:t>Passed</w:t>
+            </w:r>
+          </w:p>
+        </w:tc>
+        <w:tc>
+          <w:tcPr>
+            <w:tcW w:w="2400" w:type="dxa"/>
+          </w:tcPr>
+          <w:p>
+            <w:r>
+              <w:t>0.013</w:t>
             </w:r>
           </w:p>
         </w:tc>
@@ -894,37 +894,37 @@
           </w:tcPr>
           <w:p>
             <w:r>
-              <w:t>test_connect_drone_success_on_first_candidate</w:t>
-            </w:r>
-          </w:p>
-        </w:tc>
-        <w:tc>
-          <w:tcPr>
-            <w:tcW w:w="2400" w:type="dxa"/>
-          </w:tcPr>
-          <w:p>
-            <w:r>
-              <w:t>Connect drone success on first candidate</w:t>
-            </w:r>
-          </w:p>
-        </w:tc>
-        <w:tc>
-          <w:tcPr>
-            <w:tcW w:w="2400" w:type="dxa"/>
-          </w:tcPr>
-          <w:p>
-            <w:r>
-              <w:t>Not run</w:t>
-            </w:r>
-          </w:p>
-        </w:tc>
-        <w:tc>
-          <w:tcPr>
-            <w:tcW w:w="2400" w:type="dxa"/>
-          </w:tcPr>
-          <w:p>
-            <w:r>
-              <w:t>0.000</w:t>
+              <w:t>test_connect_drone_success_all_candidates_probed_concurrently</w:t>
+            </w:r>
+          </w:p>
+        </w:tc>
+        <w:tc>
+          <w:tcPr>
+            <w:tcW w:w="2400" w:type="dxa"/>
+          </w:tcPr>
+          <w:p>
+            <w:r>
+              <w:t>All candidates are probed concurrently (see _connect_drone docstring) — | when every candidate succeeds, the first one to complete wins and every | candidate still gets a real connect() attempt with the right kwargs.</w:t>
+            </w:r>
+          </w:p>
+        </w:tc>
+        <w:tc>
+          <w:tcPr>
+            <w:tcW w:w="2400" w:type="dxa"/>
+          </w:tcPr>
+          <w:p>
+            <w:r>
+              <w:t>Passed</w:t>
+            </w:r>
+          </w:p>
+        </w:tc>
+        <w:tc>
+          <w:tcPr>
+            <w:tcW w:w="2400" w:type="dxa"/>
+          </w:tcPr>
+          <w:p>
+            <w:r>
+              <w:t>0.027</w:t>
             </w:r>
           </w:p>
         </w:tc>
@@ -986,17 +986,17 @@
           </w:tcPr>
           <w:p>
             <w:r>
-              <w:t>Not run</w:t>
-            </w:r>
-          </w:p>
-        </w:tc>
-        <w:tc>
-          <w:tcPr>
-            <w:tcW w:w="2400" w:type="dxa"/>
-          </w:tcPr>
-          <w:p>
-            <w:r>
-              <w:t>0.000</w:t>
+              <w:t>Passed</w:t>
+            </w:r>
+          </w:p>
+        </w:tc>
+        <w:tc>
+          <w:tcPr>
+            <w:tcW w:w="2400" w:type="dxa"/>
+          </w:tcPr>
+          <w:p>
+            <w:r>
+              <w:t>0.014</w:t>
             </w:r>
           </w:p>
         </w:tc>
@@ -1058,17 +1058,17 @@
           </w:tcPr>
           <w:p>
             <w:r>
-              <w:t>Not run</w:t>
-            </w:r>
-          </w:p>
-        </w:tc>
-        <w:tc>
-          <w:tcPr>
-            <w:tcW w:w="2400" w:type="dxa"/>
-          </w:tcPr>
-          <w:p>
-            <w:r>
-              <w:t>0.000</w:t>
+              <w:t>Passed</w:t>
+            </w:r>
+          </w:p>
+        </w:tc>
+        <w:tc>
+          <w:tcPr>
+            <w:tcW w:w="2400" w:type="dxa"/>
+          </w:tcPr>
+          <w:p>
+            <w:r>
+              <w:t>0.015</w:t>
             </w:r>
           </w:p>
         </w:tc>
@@ -1130,17 +1130,17 @@
           </w:tcPr>
           <w:p>
             <w:r>
-              <w:t>Not run</w:t>
-            </w:r>
-          </w:p>
-        </w:tc>
-        <w:tc>
-          <w:tcPr>
-            <w:tcW w:w="2400" w:type="dxa"/>
-          </w:tcPr>
-          <w:p>
-            <w:r>
-              <w:t>0.000</w:t>
+              <w:t>Passed</w:t>
+            </w:r>
+          </w:p>
+        </w:tc>
+        <w:tc>
+          <w:tcPr>
+            <w:tcW w:w="2400" w:type="dxa"/>
+          </w:tcPr>
+          <w:p>
+            <w:r>
+              <w:t>0.219</w:t>
             </w:r>
           </w:p>
         </w:tc>
@@ -1202,17 +1202,17 @@
           </w:tcPr>
           <w:p>
             <w:r>
-              <w:t>Not run</w:t>
-            </w:r>
-          </w:p>
-        </w:tc>
-        <w:tc>
-          <w:tcPr>
-            <w:tcW w:w="2400" w:type="dxa"/>
-          </w:tcPr>
-          <w:p>
-            <w:r>
-              <w:t>0.000</w:t>
+              <w:t>Passed</w:t>
+            </w:r>
+          </w:p>
+        </w:tc>
+        <w:tc>
+          <w:tcPr>
+            <w:tcW w:w="2400" w:type="dxa"/>
+          </w:tcPr>
+          <w:p>
+            <w:r>
+              <w:t>0.039</w:t>
             </w:r>
           </w:p>
         </w:tc>
@@ -1274,17 +1274,17 @@
           </w:tcPr>
           <w:p>
             <w:r>
-              <w:t>Not run</w:t>
-            </w:r>
-          </w:p>
-        </w:tc>
-        <w:tc>
-          <w:tcPr>
-            <w:tcW w:w="2400" w:type="dxa"/>
-          </w:tcPr>
-          <w:p>
-            <w:r>
-              <w:t>0.000</w:t>
+              <w:t>Passed</w:t>
+            </w:r>
+          </w:p>
+        </w:tc>
+        <w:tc>
+          <w:tcPr>
+            <w:tcW w:w="2400" w:type="dxa"/>
+          </w:tcPr>
+          <w:p>
+            <w:r>
+              <w:t>0.018</w:t>
             </w:r>
           </w:p>
         </w:tc>
@@ -1346,17 +1346,17 @@
           </w:tcPr>
           <w:p>
             <w:r>
-              <w:t>Not run</w:t>
-            </w:r>
-          </w:p>
-        </w:tc>
-        <w:tc>
-          <w:tcPr>
-            <w:tcW w:w="2400" w:type="dxa"/>
-          </w:tcPr>
-          <w:p>
-            <w:r>
-              <w:t>0.000</w:t>
+              <w:t>Passed</w:t>
+            </w:r>
+          </w:p>
+        </w:tc>
+        <w:tc>
+          <w:tcPr>
+            <w:tcW w:w="2400" w:type="dxa"/>
+          </w:tcPr>
+          <w:p>
+            <w:r>
+              <w:t>0.014</w:t>
             </w:r>
           </w:p>
         </w:tc>
@@ -1418,17 +1418,17 @@
           </w:tcPr>
           <w:p>
             <w:r>
-              <w:t>Not run</w:t>
-            </w:r>
-          </w:p>
-        </w:tc>
-        <w:tc>
-          <w:tcPr>
-            <w:tcW w:w="2400" w:type="dxa"/>
-          </w:tcPr>
-          <w:p>
-            <w:r>
-              <w:t>0.000</w:t>
+              <w:t>Passed</w:t>
+            </w:r>
+          </w:p>
+        </w:tc>
+        <w:tc>
+          <w:tcPr>
+            <w:tcW w:w="2400" w:type="dxa"/>
+          </w:tcPr>
+          <w:p>
+            <w:r>
+              <w:t>0.028</w:t>
             </w:r>
           </w:p>
         </w:tc>
@@ -1490,17 +1490,17 @@
           </w:tcPr>
           <w:p>
             <w:r>
-              <w:t>Not run</w:t>
-            </w:r>
-          </w:p>
-        </w:tc>
-        <w:tc>
-          <w:tcPr>
-            <w:tcW w:w="2400" w:type="dxa"/>
-          </w:tcPr>
-          <w:p>
-            <w:r>
-              <w:t>0.000</w:t>
+              <w:t>Passed</w:t>
+            </w:r>
+          </w:p>
+        </w:tc>
+        <w:tc>
+          <w:tcPr>
+            <w:tcW w:w="2400" w:type="dxa"/>
+          </w:tcPr>
+          <w:p>
+            <w:r>
+              <w:t>0.108</w:t>
             </w:r>
           </w:p>
         </w:tc>
@@ -1562,17 +1562,17 @@
           </w:tcPr>
           <w:p>
             <w:r>
-              <w:t>Not run</w:t>
-            </w:r>
-          </w:p>
-        </w:tc>
-        <w:tc>
-          <w:tcPr>
-            <w:tcW w:w="2400" w:type="dxa"/>
-          </w:tcPr>
-          <w:p>
-            <w:r>
-              <w:t>0.000</w:t>
+              <w:t>Passed</w:t>
+            </w:r>
+          </w:p>
+        </w:tc>
+        <w:tc>
+          <w:tcPr>
+            <w:tcW w:w="2400" w:type="dxa"/>
+          </w:tcPr>
+          <w:p>
+            <w:r>
+              <w:t>0.015</w:t>
             </w:r>
           </w:p>
         </w:tc>
@@ -1634,17 +1634,17 @@
           </w:tcPr>
           <w:p>
             <w:r>
-              <w:t>Not run</w:t>
-            </w:r>
-          </w:p>
-        </w:tc>
-        <w:tc>
-          <w:tcPr>
-            <w:tcW w:w="2400" w:type="dxa"/>
-          </w:tcPr>
-          <w:p>
-            <w:r>
-              <w:t>0.000</w:t>
+              <w:t>Passed</w:t>
+            </w:r>
+          </w:p>
+        </w:tc>
+        <w:tc>
+          <w:tcPr>
+            <w:tcW w:w="2400" w:type="dxa"/>
+          </w:tcPr>
+          <w:p>
+            <w:r>
+              <w:t>0.016</w:t>
             </w:r>
           </w:p>
         </w:tc>
@@ -1706,17 +1706,17 @@
           </w:tcPr>
           <w:p>
             <w:r>
-              <w:t>Not run</w:t>
-            </w:r>
-          </w:p>
-        </w:tc>
-        <w:tc>
-          <w:tcPr>
-            <w:tcW w:w="2400" w:type="dxa"/>
-          </w:tcPr>
-          <w:p>
-            <w:r>
-              <w:t>0.000</w:t>
+              <w:t>Passed</w:t>
+            </w:r>
+          </w:p>
+        </w:tc>
+        <w:tc>
+          <w:tcPr>
+            <w:tcW w:w="2400" w:type="dxa"/>
+          </w:tcPr>
+          <w:p>
+            <w:r>
+              <w:t>0.012</w:t>
             </w:r>
           </w:p>
         </w:tc>
@@ -1778,17 +1778,17 @@
           </w:tcPr>
           <w:p>
             <w:r>
-              <w:t>Not run</w:t>
-            </w:r>
-          </w:p>
-        </w:tc>
-        <w:tc>
-          <w:tcPr>
-            <w:tcW w:w="2400" w:type="dxa"/>
-          </w:tcPr>
-          <w:p>
-            <w:r>
-              <w:t>0.000</w:t>
+              <w:t>Passed</w:t>
+            </w:r>
+          </w:p>
+        </w:tc>
+        <w:tc>
+          <w:tcPr>
+            <w:tcW w:w="2400" w:type="dxa"/>
+          </w:tcPr>
+          <w:p>
+            <w:r>
+              <w:t>0.012</w:t>
             </w:r>
           </w:p>
         </w:tc>
@@ -1850,17 +1850,17 @@
           </w:tcPr>
           <w:p>
             <w:r>
-              <w:t>Not run</w:t>
-            </w:r>
-          </w:p>
-        </w:tc>
-        <w:tc>
-          <w:tcPr>
-            <w:tcW w:w="2400" w:type="dxa"/>
-          </w:tcPr>
-          <w:p>
-            <w:r>
-              <w:t>0.000</w:t>
+              <w:t>Passed</w:t>
+            </w:r>
+          </w:p>
+        </w:tc>
+        <w:tc>
+          <w:tcPr>
+            <w:tcW w:w="2400" w:type="dxa"/>
+          </w:tcPr>
+          <w:p>
+            <w:r>
+              <w:t>0.012</w:t>
             </w:r>
           </w:p>
         </w:tc>

</xml_diff>

<commit_message>
feat: enhance MAVLink UDP support and update telemetry data structure
</commit_message>
<xml_diff>
--- a/backend/app/tests/reports/modules/test_auto_connector_documentation.docx
+++ b/backend/app/tests/reports/modules/test_auto_connector_documentation.docx
@@ -12,17 +12,17 @@
     </w:p>
     <w:p>
       <w:r>
-        <w:t>Generated at: 2026-09-23T06:18:31+00:00</w:t>
+        <w:t>Generated at: 2026-10-13T07:59:35+00:00</w:t>
       </w:r>
     </w:p>
     <w:p>
       <w:r>
-        <w:t>Test session started: 2026-09-23T06:18:30+00:00</w:t>
+        <w:t>Test session started: 2026-10-13T07:59:32+00:00</w:t>
       </w:r>
     </w:p>
     <w:p>
       <w:r>
-        <w:t>Pytest exit status: 0</w:t>
+        <w:t>Pytest exit status: 1</w:t>
       </w:r>
     </w:p>
     <w:p>
@@ -110,7 +110,7 @@
           </w:tcPr>
           <w:p>
             <w:r>
-              <w:t>22</w:t>
+              <w:t>21</w:t>
             </w:r>
           </w:p>
         </w:tc>
@@ -132,7 +132,7 @@
           </w:tcPr>
           <w:p>
             <w:r>
-              <w:t>0</w:t>
+              <w:t>1</w:t>
             </w:r>
           </w:p>
         </w:tc>
@@ -200,7 +200,7 @@
     </w:p>
     <w:p>
       <w:r>
-        <w:t>Source file: C:\Users\Chandrasekhar\Downloads\DroneArjuna_final\DroneArjuna\backend\app\tests\test_auto_connector.py</w:t>
+        <w:t>Source file: /app/app/tests/test_auto_connector.py</w:t>
       </w:r>
     </w:p>
     <w:tbl>
@@ -348,7 +348,7 @@
           </w:tcPr>
           <w:p>
             <w:r>
-              <w:t>0.014</w:t>
+              <w:t>0.027</w:t>
             </w:r>
           </w:p>
         </w:tc>
@@ -420,7 +420,7 @@
           </w:tcPr>
           <w:p>
             <w:r>
-              <w:t>0.015</w:t>
+              <w:t>0.041</w:t>
             </w:r>
           </w:p>
         </w:tc>
@@ -492,7 +492,7 @@
           </w:tcPr>
           <w:p>
             <w:r>
-              <w:t>0.013</w:t>
+              <w:t>0.041</w:t>
             </w:r>
           </w:p>
         </w:tc>
@@ -554,37 +554,37 @@
           </w:tcPr>
           <w:p>
             <w:r>
-              <w:t>Passed</w:t>
-            </w:r>
-          </w:p>
-        </w:tc>
-        <w:tc>
-          <w:tcPr>
-            <w:tcW w:w="2400" w:type="dxa"/>
-          </w:tcPr>
-          <w:p>
-            <w:r>
-              <w:t>0.012</w:t>
-            </w:r>
-          </w:p>
-        </w:tc>
-        <w:tc>
-          <w:tcPr>
-            <w:tcW w:w="2400" w:type="dxa"/>
-          </w:tcPr>
-          <w:p>
-            <w:r>
-              <w:t>-</w:t>
-            </w:r>
-          </w:p>
-        </w:tc>
-        <w:tc>
-          <w:tcPr>
-            <w:tcW w:w="2400" w:type="dxa"/>
-          </w:tcPr>
-          <w:p>
-            <w:r>
-              <w:t>-</w:t>
+              <w:t>Failed</w:t>
+            </w:r>
+          </w:p>
+        </w:tc>
+        <w:tc>
+          <w:tcPr>
+            <w:tcW w:w="2400" w:type="dxa"/>
+          </w:tcPr>
+          <w:p>
+            <w:r>
+              <w:t>0.024</w:t>
+            </w:r>
+          </w:p>
+        </w:tc>
+        <w:tc>
+          <w:tcPr>
+            <w:tcW w:w="2400" w:type="dxa"/>
+          </w:tcPr>
+          <w:p>
+            <w:r>
+              <w:t>-</w:t>
+            </w:r>
+          </w:p>
+        </w:tc>
+        <w:tc>
+          <w:tcPr>
+            <w:tcW w:w="2400" w:type="dxa"/>
+          </w:tcPr>
+          <w:p>
+            <w:r>
+              <w:t>def test_build_candidates_includes_serial_scan_results(): |         fake_port = SimpleNamespace(device="/dev/ttyUSB0", hwid="USB") |         with patch( |             "app.modules.drone_control.auto_connector.serial.tools.list_ports.comports", |             return_value=[fake_port], |         ): |             candidates = ac._build_candidates(None) |         serial_candidates = [c for c in candidates if c["transport"] == "serial"] |         assert len(serial_candidates) == 4 |         # static tcp/udp fallback list (4 entries) + 3 serial = 7 | &gt;       assert len(candidates) == 7 | E       AssertionError: assert 8 == 7</w:t>
             </w:r>
           </w:p>
         </w:tc>
@@ -636,7 +636,7 @@
           </w:tcPr>
           <w:p>
             <w:r>
-              <w:t>0.023</w:t>
+              <w:t>0.021</w:t>
             </w:r>
           </w:p>
         </w:tc>
@@ -708,7 +708,7 @@
           </w:tcPr>
           <w:p>
             <w:r>
-              <w:t>0.014</w:t>
+              <w:t>0.025</w:t>
             </w:r>
           </w:p>
         </w:tc>
@@ -780,7 +780,7 @@
           </w:tcPr>
           <w:p>
             <w:r>
-              <w:t>0.047</w:t>
+              <w:t>0.044</w:t>
             </w:r>
           </w:p>
         </w:tc>
@@ -852,7 +852,7 @@
           </w:tcPr>
           <w:p>
             <w:r>
-              <w:t>0.013</w:t>
+              <w:t>0.029</w:t>
             </w:r>
           </w:p>
         </w:tc>
@@ -924,6 +924,294 @@
           </w:tcPr>
           <w:p>
             <w:r>
+              <w:t>0.045</w:t>
+            </w:r>
+          </w:p>
+        </w:tc>
+        <w:tc>
+          <w:tcPr>
+            <w:tcW w:w="2400" w:type="dxa"/>
+          </w:tcPr>
+          <w:p>
+            <w:r>
+              <w:t>asyncio</w:t>
+            </w:r>
+          </w:p>
+        </w:tc>
+        <w:tc>
+          <w:tcPr>
+            <w:tcW w:w="2400" w:type="dxa"/>
+          </w:tcPr>
+          <w:p>
+            <w:r>
+              <w:t>-</w:t>
+            </w:r>
+          </w:p>
+        </w:tc>
+      </w:tr>
+      <w:tr>
+        <w:tc>
+          <w:tcPr>
+            <w:tcW w:w="2400" w:type="dxa"/>
+          </w:tcPr>
+          <w:p>
+            <w:r>
+              <w:t>10</w:t>
+            </w:r>
+          </w:p>
+        </w:tc>
+        <w:tc>
+          <w:tcPr>
+            <w:tcW w:w="2400" w:type="dxa"/>
+          </w:tcPr>
+          <w:p>
+            <w:r>
+              <w:t>test_get_bridge_status_bad_json_returns_none</w:t>
+            </w:r>
+          </w:p>
+        </w:tc>
+        <w:tc>
+          <w:tcPr>
+            <w:tcW w:w="2400" w:type="dxa"/>
+          </w:tcPr>
+          <w:p>
+            <w:r>
+              <w:t>Any exception (timeout, malformed JSON, etc.) must never raise — returns None.</w:t>
+            </w:r>
+          </w:p>
+        </w:tc>
+        <w:tc>
+          <w:tcPr>
+            <w:tcW w:w="2400" w:type="dxa"/>
+          </w:tcPr>
+          <w:p>
+            <w:r>
+              <w:t>Passed</w:t>
+            </w:r>
+          </w:p>
+        </w:tc>
+        <w:tc>
+          <w:tcPr>
+            <w:tcW w:w="2400" w:type="dxa"/>
+          </w:tcPr>
+          <w:p>
+            <w:r>
+              <w:t>0.044</w:t>
+            </w:r>
+          </w:p>
+        </w:tc>
+        <w:tc>
+          <w:tcPr>
+            <w:tcW w:w="2400" w:type="dxa"/>
+          </w:tcPr>
+          <w:p>
+            <w:r>
+              <w:t>-</w:t>
+            </w:r>
+          </w:p>
+        </w:tc>
+        <w:tc>
+          <w:tcPr>
+            <w:tcW w:w="2400" w:type="dxa"/>
+          </w:tcPr>
+          <w:p>
+            <w:r>
+              <w:t>-</w:t>
+            </w:r>
+          </w:p>
+        </w:tc>
+      </w:tr>
+      <w:tr>
+        <w:tc>
+          <w:tcPr>
+            <w:tcW w:w="2400" w:type="dxa"/>
+          </w:tcPr>
+          <w:p>
+            <w:r>
+              <w:t>11</w:t>
+            </w:r>
+          </w:p>
+        </w:tc>
+        <w:tc>
+          <w:tcPr>
+            <w:tcW w:w="2400" w:type="dxa"/>
+          </w:tcPr>
+          <w:p>
+            <w:r>
+              <w:t>test_get_bridge_status_bridge_not_running_returns_none</w:t>
+            </w:r>
+          </w:p>
+        </w:tc>
+        <w:tc>
+          <w:tcPr>
+            <w:tcW w:w="2400" w:type="dxa"/>
+          </w:tcPr>
+          <w:p>
+            <w:r>
+              <w:t>Bridge process not up -&gt; urlopen raises -&gt; function swallows and returns None.</w:t>
+            </w:r>
+          </w:p>
+        </w:tc>
+        <w:tc>
+          <w:tcPr>
+            <w:tcW w:w="2400" w:type="dxa"/>
+          </w:tcPr>
+          <w:p>
+            <w:r>
+              <w:t>Passed</w:t>
+            </w:r>
+          </w:p>
+        </w:tc>
+        <w:tc>
+          <w:tcPr>
+            <w:tcW w:w="2400" w:type="dxa"/>
+          </w:tcPr>
+          <w:p>
+            <w:r>
+              <w:t>0.038</w:t>
+            </w:r>
+          </w:p>
+        </w:tc>
+        <w:tc>
+          <w:tcPr>
+            <w:tcW w:w="2400" w:type="dxa"/>
+          </w:tcPr>
+          <w:p>
+            <w:r>
+              <w:t>-</w:t>
+            </w:r>
+          </w:p>
+        </w:tc>
+        <w:tc>
+          <w:tcPr>
+            <w:tcW w:w="2400" w:type="dxa"/>
+          </w:tcPr>
+          <w:p>
+            <w:r>
+              <w:t>-</w:t>
+            </w:r>
+          </w:p>
+        </w:tc>
+      </w:tr>
+      <w:tr>
+        <w:tc>
+          <w:tcPr>
+            <w:tcW w:w="2400" w:type="dxa"/>
+          </w:tcPr>
+          <w:p>
+            <w:r>
+              <w:t>12</w:t>
+            </w:r>
+          </w:p>
+        </w:tc>
+        <w:tc>
+          <w:tcPr>
+            <w:tcW w:w="2400" w:type="dxa"/>
+          </w:tcPr>
+          <w:p>
+            <w:r>
+              <w:t>test_get_bridge_status_success</w:t>
+            </w:r>
+          </w:p>
+        </w:tc>
+        <w:tc>
+          <w:tcPr>
+            <w:tcW w:w="2400" w:type="dxa"/>
+          </w:tcPr>
+          <w:p>
+            <w:r>
+              <w:t>Returns the parsed JSON body when the discovery endpoint responds.</w:t>
+            </w:r>
+          </w:p>
+        </w:tc>
+        <w:tc>
+          <w:tcPr>
+            <w:tcW w:w="2400" w:type="dxa"/>
+          </w:tcPr>
+          <w:p>
+            <w:r>
+              <w:t>Passed</w:t>
+            </w:r>
+          </w:p>
+        </w:tc>
+        <w:tc>
+          <w:tcPr>
+            <w:tcW w:w="2400" w:type="dxa"/>
+          </w:tcPr>
+          <w:p>
+            <w:r>
+              <w:t>0.860</w:t>
+            </w:r>
+          </w:p>
+        </w:tc>
+        <w:tc>
+          <w:tcPr>
+            <w:tcW w:w="2400" w:type="dxa"/>
+          </w:tcPr>
+          <w:p>
+            <w:r>
+              <w:t>-</w:t>
+            </w:r>
+          </w:p>
+        </w:tc>
+        <w:tc>
+          <w:tcPr>
+            <w:tcW w:w="2400" w:type="dxa"/>
+          </w:tcPr>
+          <w:p>
+            <w:r>
+              <w:t>-</w:t>
+            </w:r>
+          </w:p>
+        </w:tc>
+      </w:tr>
+      <w:tr>
+        <w:tc>
+          <w:tcPr>
+            <w:tcW w:w="2400" w:type="dxa"/>
+          </w:tcPr>
+          <w:p>
+            <w:r>
+              <w:t>13</w:t>
+            </w:r>
+          </w:p>
+        </w:tc>
+        <w:tc>
+          <w:tcPr>
+            <w:tcW w:w="2400" w:type="dxa"/>
+          </w:tcPr>
+          <w:p>
+            <w:r>
+              <w:t>test_get_unconnected_drones_excludes_live_connections</w:t>
+            </w:r>
+          </w:p>
+        </w:tc>
+        <w:tc>
+          <w:tcPr>
+            <w:tcW w:w="2400" w:type="dxa"/>
+          </w:tcPr>
+          <w:p>
+            <w:r>
+              <w:t>Get unconnected drones excludes live connections</w:t>
+            </w:r>
+          </w:p>
+        </w:tc>
+        <w:tc>
+          <w:tcPr>
+            <w:tcW w:w="2400" w:type="dxa"/>
+          </w:tcPr>
+          <w:p>
+            <w:r>
+              <w:t>Passed</w:t>
+            </w:r>
+          </w:p>
+        </w:tc>
+        <w:tc>
+          <w:tcPr>
+            <w:tcW w:w="2400" w:type="dxa"/>
+          </w:tcPr>
+          <w:p>
+            <w:r>
               <w:t>0.027</w:t>
             </w:r>
           </w:p>
@@ -956,263 +1244,47 @@
           </w:tcPr>
           <w:p>
             <w:r>
-              <w:t>10</w:t>
-            </w:r>
-          </w:p>
-        </w:tc>
-        <w:tc>
-          <w:tcPr>
-            <w:tcW w:w="2400" w:type="dxa"/>
-          </w:tcPr>
-          <w:p>
-            <w:r>
-              <w:t>test_get_bridge_status_bad_json_returns_none</w:t>
-            </w:r>
-          </w:p>
-        </w:tc>
-        <w:tc>
-          <w:tcPr>
-            <w:tcW w:w="2400" w:type="dxa"/>
-          </w:tcPr>
-          <w:p>
-            <w:r>
-              <w:t>Any exception (timeout, malformed JSON, etc.) must never raise — returns None.</w:t>
-            </w:r>
-          </w:p>
-        </w:tc>
-        <w:tc>
-          <w:tcPr>
-            <w:tcW w:w="2400" w:type="dxa"/>
-          </w:tcPr>
-          <w:p>
-            <w:r>
-              <w:t>Passed</w:t>
-            </w:r>
-          </w:p>
-        </w:tc>
-        <w:tc>
-          <w:tcPr>
-            <w:tcW w:w="2400" w:type="dxa"/>
-          </w:tcPr>
-          <w:p>
-            <w:r>
-              <w:t>0.014</w:t>
-            </w:r>
-          </w:p>
-        </w:tc>
-        <w:tc>
-          <w:tcPr>
-            <w:tcW w:w="2400" w:type="dxa"/>
-          </w:tcPr>
-          <w:p>
-            <w:r>
-              <w:t>-</w:t>
-            </w:r>
-          </w:p>
-        </w:tc>
-        <w:tc>
-          <w:tcPr>
-            <w:tcW w:w="2400" w:type="dxa"/>
-          </w:tcPr>
-          <w:p>
-            <w:r>
-              <w:t>-</w:t>
-            </w:r>
-          </w:p>
-        </w:tc>
-      </w:tr>
-      <w:tr>
-        <w:tc>
-          <w:tcPr>
-            <w:tcW w:w="2400" w:type="dxa"/>
-          </w:tcPr>
-          <w:p>
-            <w:r>
-              <w:t>11</w:t>
-            </w:r>
-          </w:p>
-        </w:tc>
-        <w:tc>
-          <w:tcPr>
-            <w:tcW w:w="2400" w:type="dxa"/>
-          </w:tcPr>
-          <w:p>
-            <w:r>
-              <w:t>test_get_bridge_status_bridge_not_running_returns_none</w:t>
-            </w:r>
-          </w:p>
-        </w:tc>
-        <w:tc>
-          <w:tcPr>
-            <w:tcW w:w="2400" w:type="dxa"/>
-          </w:tcPr>
-          <w:p>
-            <w:r>
-              <w:t>Bridge process not up -&gt; urlopen raises -&gt; function swallows and returns None.</w:t>
-            </w:r>
-          </w:p>
-        </w:tc>
-        <w:tc>
-          <w:tcPr>
-            <w:tcW w:w="2400" w:type="dxa"/>
-          </w:tcPr>
-          <w:p>
-            <w:r>
-              <w:t>Passed</w:t>
-            </w:r>
-          </w:p>
-        </w:tc>
-        <w:tc>
-          <w:tcPr>
-            <w:tcW w:w="2400" w:type="dxa"/>
-          </w:tcPr>
-          <w:p>
-            <w:r>
-              <w:t>0.015</w:t>
-            </w:r>
-          </w:p>
-        </w:tc>
-        <w:tc>
-          <w:tcPr>
-            <w:tcW w:w="2400" w:type="dxa"/>
-          </w:tcPr>
-          <w:p>
-            <w:r>
-              <w:t>-</w:t>
-            </w:r>
-          </w:p>
-        </w:tc>
-        <w:tc>
-          <w:tcPr>
-            <w:tcW w:w="2400" w:type="dxa"/>
-          </w:tcPr>
-          <w:p>
-            <w:r>
-              <w:t>-</w:t>
-            </w:r>
-          </w:p>
-        </w:tc>
-      </w:tr>
-      <w:tr>
-        <w:tc>
-          <w:tcPr>
-            <w:tcW w:w="2400" w:type="dxa"/>
-          </w:tcPr>
-          <w:p>
-            <w:r>
-              <w:t>12</w:t>
-            </w:r>
-          </w:p>
-        </w:tc>
-        <w:tc>
-          <w:tcPr>
-            <w:tcW w:w="2400" w:type="dxa"/>
-          </w:tcPr>
-          <w:p>
-            <w:r>
-              <w:t>test_get_bridge_status_success</w:t>
-            </w:r>
-          </w:p>
-        </w:tc>
-        <w:tc>
-          <w:tcPr>
-            <w:tcW w:w="2400" w:type="dxa"/>
-          </w:tcPr>
-          <w:p>
-            <w:r>
-              <w:t>Returns the parsed JSON body when the discovery endpoint responds.</w:t>
-            </w:r>
-          </w:p>
-        </w:tc>
-        <w:tc>
-          <w:tcPr>
-            <w:tcW w:w="2400" w:type="dxa"/>
-          </w:tcPr>
-          <w:p>
-            <w:r>
-              <w:t>Passed</w:t>
-            </w:r>
-          </w:p>
-        </w:tc>
-        <w:tc>
-          <w:tcPr>
-            <w:tcW w:w="2400" w:type="dxa"/>
-          </w:tcPr>
-          <w:p>
-            <w:r>
-              <w:t>0.219</w:t>
-            </w:r>
-          </w:p>
-        </w:tc>
-        <w:tc>
-          <w:tcPr>
-            <w:tcW w:w="2400" w:type="dxa"/>
-          </w:tcPr>
-          <w:p>
-            <w:r>
-              <w:t>-</w:t>
-            </w:r>
-          </w:p>
-        </w:tc>
-        <w:tc>
-          <w:tcPr>
-            <w:tcW w:w="2400" w:type="dxa"/>
-          </w:tcPr>
-          <w:p>
-            <w:r>
-              <w:t>-</w:t>
-            </w:r>
-          </w:p>
-        </w:tc>
-      </w:tr>
-      <w:tr>
-        <w:tc>
-          <w:tcPr>
-            <w:tcW w:w="2400" w:type="dxa"/>
-          </w:tcPr>
-          <w:p>
-            <w:r>
-              <w:t>13</w:t>
-            </w:r>
-          </w:p>
-        </w:tc>
-        <w:tc>
-          <w:tcPr>
-            <w:tcW w:w="2400" w:type="dxa"/>
-          </w:tcPr>
-          <w:p>
-            <w:r>
-              <w:t>test_get_unconnected_drones_excludes_live_connections</w:t>
-            </w:r>
-          </w:p>
-        </w:tc>
-        <w:tc>
-          <w:tcPr>
-            <w:tcW w:w="2400" w:type="dxa"/>
-          </w:tcPr>
-          <w:p>
-            <w:r>
-              <w:t>Get unconnected drones excludes live connections</w:t>
-            </w:r>
-          </w:p>
-        </w:tc>
-        <w:tc>
-          <w:tcPr>
-            <w:tcW w:w="2400" w:type="dxa"/>
-          </w:tcPr>
-          <w:p>
-            <w:r>
-              <w:t>Passed</w:t>
-            </w:r>
-          </w:p>
-        </w:tc>
-        <w:tc>
-          <w:tcPr>
-            <w:tcW w:w="2400" w:type="dxa"/>
-          </w:tcPr>
-          <w:p>
-            <w:r>
-              <w:t>0.039</w:t>
+              <w:t>14</w:t>
+            </w:r>
+          </w:p>
+        </w:tc>
+        <w:tc>
+          <w:tcPr>
+            <w:tcW w:w="2400" w:type="dxa"/>
+          </w:tcPr>
+          <w:p>
+            <w:r>
+              <w:t>test_get_unconnected_drones_includes_stale_disconnected_entry</w:t>
+            </w:r>
+          </w:p>
+        </w:tc>
+        <w:tc>
+          <w:tcPr>
+            <w:tcW w:w="2400" w:type="dxa"/>
+          </w:tcPr>
+          <w:p>
+            <w:r>
+              <w:t>A connection dict entry that exists but is marked connected=False still counts as unconnected.</w:t>
+            </w:r>
+          </w:p>
+        </w:tc>
+        <w:tc>
+          <w:tcPr>
+            <w:tcW w:w="2400" w:type="dxa"/>
+          </w:tcPr>
+          <w:p>
+            <w:r>
+              <w:t>Passed</w:t>
+            </w:r>
+          </w:p>
+        </w:tc>
+        <w:tc>
+          <w:tcPr>
+            <w:tcW w:w="2400" w:type="dxa"/>
+          </w:tcPr>
+          <w:p>
+            <w:r>
+              <w:t>0.026</w:t>
             </w:r>
           </w:p>
         </w:tc>
@@ -1244,47 +1316,47 @@
           </w:tcPr>
           <w:p>
             <w:r>
-              <w:t>14</w:t>
-            </w:r>
-          </w:p>
-        </w:tc>
-        <w:tc>
-          <w:tcPr>
-            <w:tcW w:w="2400" w:type="dxa"/>
-          </w:tcPr>
-          <w:p>
-            <w:r>
-              <w:t>test_get_unconnected_drones_includes_stale_disconnected_entry</w:t>
-            </w:r>
-          </w:p>
-        </w:tc>
-        <w:tc>
-          <w:tcPr>
-            <w:tcW w:w="2400" w:type="dxa"/>
-          </w:tcPr>
-          <w:p>
-            <w:r>
-              <w:t>A connection dict entry that exists but is marked connected=False still counts as unconnected.</w:t>
-            </w:r>
-          </w:p>
-        </w:tc>
-        <w:tc>
-          <w:tcPr>
-            <w:tcW w:w="2400" w:type="dxa"/>
-          </w:tcPr>
-          <w:p>
-            <w:r>
-              <w:t>Passed</w:t>
-            </w:r>
-          </w:p>
-        </w:tc>
-        <w:tc>
-          <w:tcPr>
-            <w:tcW w:w="2400" w:type="dxa"/>
-          </w:tcPr>
-          <w:p>
-            <w:r>
-              <w:t>0.018</w:t>
+              <w:t>15</w:t>
+            </w:r>
+          </w:p>
+        </w:tc>
+        <w:tc>
+          <w:tcPr>
+            <w:tcW w:w="2400" w:type="dxa"/>
+          </w:tcPr>
+          <w:p>
+            <w:r>
+              <w:t>test_get_unconnected_drones_no_drones_returns_empty</w:t>
+            </w:r>
+          </w:p>
+        </w:tc>
+        <w:tc>
+          <w:tcPr>
+            <w:tcW w:w="2400" w:type="dxa"/>
+          </w:tcPr>
+          <w:p>
+            <w:r>
+              <w:t>Get unconnected drones no drones returns empty</w:t>
+            </w:r>
+          </w:p>
+        </w:tc>
+        <w:tc>
+          <w:tcPr>
+            <w:tcW w:w="2400" w:type="dxa"/>
+          </w:tcPr>
+          <w:p>
+            <w:r>
+              <w:t>Passed</w:t>
+            </w:r>
+          </w:p>
+        </w:tc>
+        <w:tc>
+          <w:tcPr>
+            <w:tcW w:w="2400" w:type="dxa"/>
+          </w:tcPr>
+          <w:p>
+            <w:r>
+              <w:t>0.031</w:t>
             </w:r>
           </w:p>
         </w:tc>
@@ -1316,47 +1388,47 @@
           </w:tcPr>
           <w:p>
             <w:r>
-              <w:t>15</w:t>
-            </w:r>
-          </w:p>
-        </w:tc>
-        <w:tc>
-          <w:tcPr>
-            <w:tcW w:w="2400" w:type="dxa"/>
-          </w:tcPr>
-          <w:p>
-            <w:r>
-              <w:t>test_get_unconnected_drones_no_drones_returns_empty</w:t>
-            </w:r>
-          </w:p>
-        </w:tc>
-        <w:tc>
-          <w:tcPr>
-            <w:tcW w:w="2400" w:type="dxa"/>
-          </w:tcPr>
-          <w:p>
-            <w:r>
-              <w:t>Get unconnected drones no drones returns empty</w:t>
-            </w:r>
-          </w:p>
-        </w:tc>
-        <w:tc>
-          <w:tcPr>
-            <w:tcW w:w="2400" w:type="dxa"/>
-          </w:tcPr>
-          <w:p>
-            <w:r>
-              <w:t>Passed</w:t>
-            </w:r>
-          </w:p>
-        </w:tc>
-        <w:tc>
-          <w:tcPr>
-            <w:tcW w:w="2400" w:type="dxa"/>
-          </w:tcPr>
-          <w:p>
-            <w:r>
-              <w:t>0.014</w:t>
+              <w:t>16</w:t>
+            </w:r>
+          </w:p>
+        </w:tc>
+        <w:tc>
+          <w:tcPr>
+            <w:tcW w:w="2400" w:type="dxa"/>
+          </w:tcPr>
+          <w:p>
+            <w:r>
+              <w:t>test_run_auto_connector_cancelled_during_startup_delay_stops_cleanly</w:t>
+            </w:r>
+          </w:p>
+        </w:tc>
+        <w:tc>
+          <w:tcPr>
+            <w:tcW w:w="2400" w:type="dxa"/>
+          </w:tcPr>
+          <w:p>
+            <w:r>
+              <w:t>Run auto connector cancelled during startup delay stops cleanly</w:t>
+            </w:r>
+          </w:p>
+        </w:tc>
+        <w:tc>
+          <w:tcPr>
+            <w:tcW w:w="2400" w:type="dxa"/>
+          </w:tcPr>
+          <w:p>
+            <w:r>
+              <w:t>Passed</w:t>
+            </w:r>
+          </w:p>
+        </w:tc>
+        <w:tc>
+          <w:tcPr>
+            <w:tcW w:w="2400" w:type="dxa"/>
+          </w:tcPr>
+          <w:p>
+            <w:r>
+              <w:t>0.068</w:t>
             </w:r>
           </w:p>
         </w:tc>
@@ -1388,27 +1460,243 @@
           </w:tcPr>
           <w:p>
             <w:r>
-              <w:t>16</w:t>
-            </w:r>
-          </w:p>
-        </w:tc>
-        <w:tc>
-          <w:tcPr>
-            <w:tcW w:w="2400" w:type="dxa"/>
-          </w:tcPr>
-          <w:p>
-            <w:r>
-              <w:t>test_run_auto_connector_cancelled_during_startup_delay_stops_cleanly</w:t>
-            </w:r>
-          </w:p>
-        </w:tc>
-        <w:tc>
-          <w:tcPr>
-            <w:tcW w:w="2400" w:type="dxa"/>
-          </w:tcPr>
-          <w:p>
-            <w:r>
-              <w:t>Run auto connector cancelled during startup delay stops cleanly</w:t>
+              <w:t>17</w:t>
+            </w:r>
+          </w:p>
+        </w:tc>
+        <w:tc>
+          <w:tcPr>
+            <w:tcW w:w="2400" w:type="dxa"/>
+          </w:tcPr>
+          <w:p>
+            <w:r>
+              <w:t>test_run_auto_connector_connects_unconnected_drone_then_stops</w:t>
+            </w:r>
+          </w:p>
+        </w:tc>
+        <w:tc>
+          <w:tcPr>
+            <w:tcW w:w="2400" w:type="dxa"/>
+          </w:tcPr>
+          <w:p>
+            <w:r>
+              <w:t>First loop iteration: bridge reports cable just plugged in, one unconnected | drone exists -&gt; _connect_drone must be invoked for it. The loop is stopped | by making the second asyncio.sleep call raise CancelledError, simulating | the task being cancelled on app shutdown.</w:t>
+            </w:r>
+          </w:p>
+        </w:tc>
+        <w:tc>
+          <w:tcPr>
+            <w:tcW w:w="2400" w:type="dxa"/>
+          </w:tcPr>
+          <w:p>
+            <w:r>
+              <w:t>Passed</w:t>
+            </w:r>
+          </w:p>
+        </w:tc>
+        <w:tc>
+          <w:tcPr>
+            <w:tcW w:w="2400" w:type="dxa"/>
+          </w:tcPr>
+          <w:p>
+            <w:r>
+              <w:t>0.043</w:t>
+            </w:r>
+          </w:p>
+        </w:tc>
+        <w:tc>
+          <w:tcPr>
+            <w:tcW w:w="2400" w:type="dxa"/>
+          </w:tcPr>
+          <w:p>
+            <w:r>
+              <w:t>asyncio</w:t>
+            </w:r>
+          </w:p>
+        </w:tc>
+        <w:tc>
+          <w:tcPr>
+            <w:tcW w:w="2400" w:type="dxa"/>
+          </w:tcPr>
+          <w:p>
+            <w:r>
+              <w:t>-</w:t>
+            </w:r>
+          </w:p>
+        </w:tc>
+      </w:tr>
+      <w:tr>
+        <w:tc>
+          <w:tcPr>
+            <w:tcW w:w="2400" w:type="dxa"/>
+          </w:tcPr>
+          <w:p>
+            <w:r>
+              <w:t>18</w:t>
+            </w:r>
+          </w:p>
+        </w:tc>
+        <w:tc>
+          <w:tcPr>
+            <w:tcW w:w="2400" w:type="dxa"/>
+          </w:tcPr>
+          <w:p>
+            <w:r>
+              <w:t>test_run_auto_connector_cycle_error_is_logged_and_loop_continues</w:t>
+            </w:r>
+          </w:p>
+        </w:tc>
+        <w:tc>
+          <w:tcPr>
+            <w:tcW w:w="2400" w:type="dxa"/>
+          </w:tcPr>
+          <w:p>
+            <w:r>
+              <w:t>An unexpected exception inside the loop body (e.g. DB connection blip) | must be caught, logged, and NOT propagate — the loop keeps running until | cancelled on the following cycle.</w:t>
+            </w:r>
+          </w:p>
+        </w:tc>
+        <w:tc>
+          <w:tcPr>
+            <w:tcW w:w="2400" w:type="dxa"/>
+          </w:tcPr>
+          <w:p>
+            <w:r>
+              <w:t>Passed</w:t>
+            </w:r>
+          </w:p>
+        </w:tc>
+        <w:tc>
+          <w:tcPr>
+            <w:tcW w:w="2400" w:type="dxa"/>
+          </w:tcPr>
+          <w:p>
+            <w:r>
+              <w:t>0.027</w:t>
+            </w:r>
+          </w:p>
+        </w:tc>
+        <w:tc>
+          <w:tcPr>
+            <w:tcW w:w="2400" w:type="dxa"/>
+          </w:tcPr>
+          <w:p>
+            <w:r>
+              <w:t>asyncio</w:t>
+            </w:r>
+          </w:p>
+        </w:tc>
+        <w:tc>
+          <w:tcPr>
+            <w:tcW w:w="2400" w:type="dxa"/>
+          </w:tcPr>
+          <w:p>
+            <w:r>
+              <w:t>-</w:t>
+            </w:r>
+          </w:p>
+        </w:tc>
+      </w:tr>
+      <w:tr>
+        <w:tc>
+          <w:tcPr>
+            <w:tcW w:w="2400" w:type="dxa"/>
+          </w:tcPr>
+          <w:p>
+            <w:r>
+              <w:t>19</w:t>
+            </w:r>
+          </w:p>
+        </w:tc>
+        <w:tc>
+          <w:tcPr>
+            <w:tcW w:w="2400" w:type="dxa"/>
+          </w:tcPr>
+          <w:p>
+            <w:r>
+              <w:t>test_run_auto_connector_no_drone_instances_skips_connect</w:t>
+            </w:r>
+          </w:p>
+        </w:tc>
+        <w:tc>
+          <w:tcPr>
+            <w:tcW w:w="2400" w:type="dxa"/>
+          </w:tcPr>
+          <w:p>
+            <w:r>
+              <w:t>No drones in the DB at all -&gt; _connect_drone is never called; loop must not crash.</w:t>
+            </w:r>
+          </w:p>
+        </w:tc>
+        <w:tc>
+          <w:tcPr>
+            <w:tcW w:w="2400" w:type="dxa"/>
+          </w:tcPr>
+          <w:p>
+            <w:r>
+              <w:t>Passed</w:t>
+            </w:r>
+          </w:p>
+        </w:tc>
+        <w:tc>
+          <w:tcPr>
+            <w:tcW w:w="2400" w:type="dxa"/>
+          </w:tcPr>
+          <w:p>
+            <w:r>
+              <w:t>0.034</w:t>
+            </w:r>
+          </w:p>
+        </w:tc>
+        <w:tc>
+          <w:tcPr>
+            <w:tcW w:w="2400" w:type="dxa"/>
+          </w:tcPr>
+          <w:p>
+            <w:r>
+              <w:t>asyncio</w:t>
+            </w:r>
+          </w:p>
+        </w:tc>
+        <w:tc>
+          <w:tcPr>
+            <w:tcW w:w="2400" w:type="dxa"/>
+          </w:tcPr>
+          <w:p>
+            <w:r>
+              <w:t>-</w:t>
+            </w:r>
+          </w:p>
+        </w:tc>
+      </w:tr>
+      <w:tr>
+        <w:tc>
+          <w:tcPr>
+            <w:tcW w:w="2400" w:type="dxa"/>
+          </w:tcPr>
+          <w:p>
+            <w:r>
+              <w:t>20</w:t>
+            </w:r>
+          </w:p>
+        </w:tc>
+        <w:tc>
+          <w:tcPr>
+            <w:tcW w:w="2400" w:type="dxa"/>
+          </w:tcPr>
+          <w:p>
+            <w:r>
+              <w:t>test_scan_linux_serial_no_ports_returns_empty</w:t>
+            </w:r>
+          </w:p>
+        </w:tc>
+        <w:tc>
+          <w:tcPr>
+            <w:tcW w:w="2400" w:type="dxa"/>
+          </w:tcPr>
+          <w:p>
+            <w:r>
+              <w:t>Scan linux serial no ports returns empty</w:t>
             </w:r>
           </w:p>
         </w:tc>
@@ -1438,294 +1726,6 @@
           </w:tcPr>
           <w:p>
             <w:r>
-              <w:t>asyncio</w:t>
-            </w:r>
-          </w:p>
-        </w:tc>
-        <w:tc>
-          <w:tcPr>
-            <w:tcW w:w="2400" w:type="dxa"/>
-          </w:tcPr>
-          <w:p>
-            <w:r>
-              <w:t>-</w:t>
-            </w:r>
-          </w:p>
-        </w:tc>
-      </w:tr>
-      <w:tr>
-        <w:tc>
-          <w:tcPr>
-            <w:tcW w:w="2400" w:type="dxa"/>
-          </w:tcPr>
-          <w:p>
-            <w:r>
-              <w:t>17</w:t>
-            </w:r>
-          </w:p>
-        </w:tc>
-        <w:tc>
-          <w:tcPr>
-            <w:tcW w:w="2400" w:type="dxa"/>
-          </w:tcPr>
-          <w:p>
-            <w:r>
-              <w:t>test_run_auto_connector_connects_unconnected_drone_then_stops</w:t>
-            </w:r>
-          </w:p>
-        </w:tc>
-        <w:tc>
-          <w:tcPr>
-            <w:tcW w:w="2400" w:type="dxa"/>
-          </w:tcPr>
-          <w:p>
-            <w:r>
-              <w:t>First loop iteration: bridge reports cable just plugged in, one unconnected | drone exists -&gt; _connect_drone must be invoked for it. The loop is stopped | by making the second asyncio.sleep call raise CancelledError, simulating | the task being cancelled on app shutdown.</w:t>
-            </w:r>
-          </w:p>
-        </w:tc>
-        <w:tc>
-          <w:tcPr>
-            <w:tcW w:w="2400" w:type="dxa"/>
-          </w:tcPr>
-          <w:p>
-            <w:r>
-              <w:t>Passed</w:t>
-            </w:r>
-          </w:p>
-        </w:tc>
-        <w:tc>
-          <w:tcPr>
-            <w:tcW w:w="2400" w:type="dxa"/>
-          </w:tcPr>
-          <w:p>
-            <w:r>
-              <w:t>0.108</w:t>
-            </w:r>
-          </w:p>
-        </w:tc>
-        <w:tc>
-          <w:tcPr>
-            <w:tcW w:w="2400" w:type="dxa"/>
-          </w:tcPr>
-          <w:p>
-            <w:r>
-              <w:t>asyncio</w:t>
-            </w:r>
-          </w:p>
-        </w:tc>
-        <w:tc>
-          <w:tcPr>
-            <w:tcW w:w="2400" w:type="dxa"/>
-          </w:tcPr>
-          <w:p>
-            <w:r>
-              <w:t>-</w:t>
-            </w:r>
-          </w:p>
-        </w:tc>
-      </w:tr>
-      <w:tr>
-        <w:tc>
-          <w:tcPr>
-            <w:tcW w:w="2400" w:type="dxa"/>
-          </w:tcPr>
-          <w:p>
-            <w:r>
-              <w:t>18</w:t>
-            </w:r>
-          </w:p>
-        </w:tc>
-        <w:tc>
-          <w:tcPr>
-            <w:tcW w:w="2400" w:type="dxa"/>
-          </w:tcPr>
-          <w:p>
-            <w:r>
-              <w:t>test_run_auto_connector_cycle_error_is_logged_and_loop_continues</w:t>
-            </w:r>
-          </w:p>
-        </w:tc>
-        <w:tc>
-          <w:tcPr>
-            <w:tcW w:w="2400" w:type="dxa"/>
-          </w:tcPr>
-          <w:p>
-            <w:r>
-              <w:t>An unexpected exception inside the loop body (e.g. DB connection blip) | must be caught, logged, and NOT propagate — the loop keeps running until | cancelled on the following cycle.</w:t>
-            </w:r>
-          </w:p>
-        </w:tc>
-        <w:tc>
-          <w:tcPr>
-            <w:tcW w:w="2400" w:type="dxa"/>
-          </w:tcPr>
-          <w:p>
-            <w:r>
-              <w:t>Passed</w:t>
-            </w:r>
-          </w:p>
-        </w:tc>
-        <w:tc>
-          <w:tcPr>
-            <w:tcW w:w="2400" w:type="dxa"/>
-          </w:tcPr>
-          <w:p>
-            <w:r>
-              <w:t>0.015</w:t>
-            </w:r>
-          </w:p>
-        </w:tc>
-        <w:tc>
-          <w:tcPr>
-            <w:tcW w:w="2400" w:type="dxa"/>
-          </w:tcPr>
-          <w:p>
-            <w:r>
-              <w:t>asyncio</w:t>
-            </w:r>
-          </w:p>
-        </w:tc>
-        <w:tc>
-          <w:tcPr>
-            <w:tcW w:w="2400" w:type="dxa"/>
-          </w:tcPr>
-          <w:p>
-            <w:r>
-              <w:t>-</w:t>
-            </w:r>
-          </w:p>
-        </w:tc>
-      </w:tr>
-      <w:tr>
-        <w:tc>
-          <w:tcPr>
-            <w:tcW w:w="2400" w:type="dxa"/>
-          </w:tcPr>
-          <w:p>
-            <w:r>
-              <w:t>19</w:t>
-            </w:r>
-          </w:p>
-        </w:tc>
-        <w:tc>
-          <w:tcPr>
-            <w:tcW w:w="2400" w:type="dxa"/>
-          </w:tcPr>
-          <w:p>
-            <w:r>
-              <w:t>test_run_auto_connector_no_drone_instances_skips_connect</w:t>
-            </w:r>
-          </w:p>
-        </w:tc>
-        <w:tc>
-          <w:tcPr>
-            <w:tcW w:w="2400" w:type="dxa"/>
-          </w:tcPr>
-          <w:p>
-            <w:r>
-              <w:t>No drones in the DB at all -&gt; _connect_drone is never called; loop must not crash.</w:t>
-            </w:r>
-          </w:p>
-        </w:tc>
-        <w:tc>
-          <w:tcPr>
-            <w:tcW w:w="2400" w:type="dxa"/>
-          </w:tcPr>
-          <w:p>
-            <w:r>
-              <w:t>Passed</w:t>
-            </w:r>
-          </w:p>
-        </w:tc>
-        <w:tc>
-          <w:tcPr>
-            <w:tcW w:w="2400" w:type="dxa"/>
-          </w:tcPr>
-          <w:p>
-            <w:r>
-              <w:t>0.016</w:t>
-            </w:r>
-          </w:p>
-        </w:tc>
-        <w:tc>
-          <w:tcPr>
-            <w:tcW w:w="2400" w:type="dxa"/>
-          </w:tcPr>
-          <w:p>
-            <w:r>
-              <w:t>asyncio</w:t>
-            </w:r>
-          </w:p>
-        </w:tc>
-        <w:tc>
-          <w:tcPr>
-            <w:tcW w:w="2400" w:type="dxa"/>
-          </w:tcPr>
-          <w:p>
-            <w:r>
-              <w:t>-</w:t>
-            </w:r>
-          </w:p>
-        </w:tc>
-      </w:tr>
-      <w:tr>
-        <w:tc>
-          <w:tcPr>
-            <w:tcW w:w="2400" w:type="dxa"/>
-          </w:tcPr>
-          <w:p>
-            <w:r>
-              <w:t>20</w:t>
-            </w:r>
-          </w:p>
-        </w:tc>
-        <w:tc>
-          <w:tcPr>
-            <w:tcW w:w="2400" w:type="dxa"/>
-          </w:tcPr>
-          <w:p>
-            <w:r>
-              <w:t>test_scan_linux_serial_no_ports_returns_empty</w:t>
-            </w:r>
-          </w:p>
-        </w:tc>
-        <w:tc>
-          <w:tcPr>
-            <w:tcW w:w="2400" w:type="dxa"/>
-          </w:tcPr>
-          <w:p>
-            <w:r>
-              <w:t>Scan linux serial no ports returns empty</w:t>
-            </w:r>
-          </w:p>
-        </w:tc>
-        <w:tc>
-          <w:tcPr>
-            <w:tcW w:w="2400" w:type="dxa"/>
-          </w:tcPr>
-          <w:p>
-            <w:r>
-              <w:t>Passed</w:t>
-            </w:r>
-          </w:p>
-        </w:tc>
-        <w:tc>
-          <w:tcPr>
-            <w:tcW w:w="2400" w:type="dxa"/>
-          </w:tcPr>
-          <w:p>
-            <w:r>
-              <w:t>0.012</w:t>
-            </w:r>
-          </w:p>
-        </w:tc>
-        <w:tc>
-          <w:tcPr>
-            <w:tcW w:w="2400" w:type="dxa"/>
-          </w:tcPr>
-          <w:p>
-            <w:r>
               <w:t>-</w:t>
             </w:r>
           </w:p>
@@ -1788,7 +1788,7 @@
           </w:tcPr>
           <w:p>
             <w:r>
-              <w:t>0.012</w:t>
+              <w:t>0.029</w:t>
             </w:r>
           </w:p>
         </w:tc>
@@ -1830,37 +1830,37 @@
           </w:tcPr>
           <w:p>
             <w:r>
-              <w:t>test_scan_linux_serial_usb_device_tries_three_bauds</w:t>
-            </w:r>
-          </w:p>
-        </w:tc>
-        <w:tc>
-          <w:tcPr>
-            <w:tcW w:w="2400" w:type="dxa"/>
-          </w:tcPr>
-          <w:p>
-            <w:r>
-              <w:t>Scan linux serial usb device tries three bauds</w:t>
-            </w:r>
-          </w:p>
-        </w:tc>
-        <w:tc>
-          <w:tcPr>
-            <w:tcW w:w="2400" w:type="dxa"/>
-          </w:tcPr>
-          <w:p>
-            <w:r>
-              <w:t>Passed</w:t>
-            </w:r>
-          </w:p>
-        </w:tc>
-        <w:tc>
-          <w:tcPr>
-            <w:tcW w:w="2400" w:type="dxa"/>
-          </w:tcPr>
-          <w:p>
-            <w:r>
-              <w:t>0.012</w:t>
+              <w:t>test_scan_linux_serial_usb_device_tries_four_bauds</w:t>
+            </w:r>
+          </w:p>
+        </w:tc>
+        <w:tc>
+          <w:tcPr>
+            <w:tcW w:w="2400" w:type="dxa"/>
+          </w:tcPr>
+          <w:p>
+            <w:r>
+              <w:t>Scan linux serial usb device tries four bauds</w:t>
+            </w:r>
+          </w:p>
+        </w:tc>
+        <w:tc>
+          <w:tcPr>
+            <w:tcW w:w="2400" w:type="dxa"/>
+          </w:tcPr>
+          <w:p>
+            <w:r>
+              <w:t>Passed</w:t>
+            </w:r>
+          </w:p>
+        </w:tc>
+        <w:tc>
+          <w:tcPr>
+            <w:tcW w:w="2400" w:type="dxa"/>
+          </w:tcPr>
+          <w:p>
+            <w:r>
+              <w:t>0.028</w:t>
             </w:r>
           </w:p>
         </w:tc>

</xml_diff>